<commit_message>
SOFT-645: Ejemplos de estructuras de datos
</commit_message>
<xml_diff>
--- a/Microcursos/SOFT-645/Consignas/Laboratorio 1.docx
+++ b/Microcursos/SOFT-645/Consignas/Laboratorio 1.docx
@@ -360,10 +360,16 @@
               <w:t xml:space="preserve">Semana </w:t>
             </w:r>
             <w:r>
-              <w:t>2</w:t>
-            </w:r>
-            <w:r>
-              <w:t xml:space="preserve"> (13/10/2026)</w:t>
+              <w:t>4</w:t>
+            </w:r>
+            <w:r>
+              <w:t xml:space="preserve"> (</w:t>
+            </w:r>
+            <w:r>
+              <w:t>27</w:t>
+            </w:r>
+            <w:r>
+              <w:t>/10/2026)</w:t>
             </w:r>
             <w:r>
               <w:t xml:space="preserve">, 18:00 </w:t>
@@ -473,7 +479,13 @@
               <w:spacing w:before="0" w:after="0"/>
             </w:pPr>
             <w:r>
-              <w:t>Archivo .</w:t>
+              <w:t>Archivo</w:t>
+            </w:r>
+            <w:r>
+              <w:t>s</w:t>
+            </w:r>
+            <w:r>
+              <w:t xml:space="preserve"> .</w:t>
             </w:r>
             <w:proofErr w:type="spellStart"/>
             <w:r>
@@ -883,21 +895,13 @@
               <w:spacing w:before="0" w:after="0"/>
             </w:pPr>
             <w:r>
-              <w:t xml:space="preserve">Describe las funciones básicas del lenguaje </w:t>
-            </w:r>
-            <w:proofErr w:type="gramStart"/>
-            <w:r>
-              <w:t xml:space="preserve">de </w:t>
+              <w:t xml:space="preserve">Describe las funciones básicas del lenguaje de </w:t>
             </w:r>
             <w:r>
               <w:t xml:space="preserve"> p</w:t>
             </w:r>
             <w:r>
-              <w:t>rogramación</w:t>
-            </w:r>
-            <w:proofErr w:type="gramEnd"/>
-            <w:r>
-              <w:t xml:space="preserve"> Python para el diseño de</w:t>
+              <w:t>rogramación Python para el diseño de</w:t>
             </w:r>
             <w:r>
               <w:t xml:space="preserve"> </w:t>
@@ -971,7 +975,14 @@
           <w:b/>
           <w:bCs/>
         </w:rPr>
-        <w:t xml:space="preserve"> 1</w:t>
+        <w:t xml:space="preserve"> </w:t>
+      </w:r>
+      <w:r>
+        <w:rPr>
+          <w:b/>
+          <w:bCs/>
+        </w:rPr>
+        <w:t>3</w:t>
       </w:r>
       <w:r>
         <w:t>.</w:t>
@@ -1037,22 +1048,7 @@
         <w:spacing w:after="0"/>
       </w:pPr>
       <w:r>
-        <w:t>Entregue un único archivo .zip que contenga:</w:t>
-      </w:r>
-    </w:p>
-    <w:p>
-      <w:pPr>
-        <w:pStyle w:val="Prrafodelista"/>
-        <w:numPr>
-          <w:ilvl w:val="0"/>
-          <w:numId w:val="17"/>
-        </w:numPr>
-        <w:spacing w:after="120"/>
-        <w:ind w:left="714" w:hanging="357"/>
-        <w:contextualSpacing w:val="0"/>
-      </w:pPr>
-      <w:r>
-        <w:t>Un archivo .</w:t>
+        <w:t>Entregue un archivo .</w:t>
       </w:r>
       <w:proofErr w:type="spellStart"/>
       <w:r>
@@ -1060,111 +1056,7 @@
       </w:r>
       <w:proofErr w:type="spellEnd"/>
       <w:r>
-        <w:t xml:space="preserve"> por cada ejercicio de Python realizado durante la semana.</w:t>
-      </w:r>
-    </w:p>
-    <w:p>
-      <w:pPr>
-        <w:pStyle w:val="Prrafodelista"/>
-        <w:numPr>
-          <w:ilvl w:val="0"/>
-          <w:numId w:val="17"/>
-        </w:numPr>
-        <w:spacing w:after="120"/>
-        <w:ind w:left="714" w:hanging="357"/>
-        <w:contextualSpacing w:val="0"/>
-      </w:pPr>
-      <w:r>
-        <w:t>Un archivo .</w:t>
-      </w:r>
-      <w:proofErr w:type="spellStart"/>
-      <w:r>
-        <w:t>pdf</w:t>
-      </w:r>
-      <w:proofErr w:type="spellEnd"/>
-      <w:r>
-        <w:t xml:space="preserve"> por cada diagrama de flujo elaborado.</w:t>
-      </w:r>
-    </w:p>
-    <w:p>
-      <w:pPr>
-        <w:spacing w:after="0"/>
-      </w:pPr>
-      <w:r>
-        <w:t>Si durante la semana se realizaron 3 ejercicios de Python, el archivo .zip deberá contener, como mínimo:</w:t>
-      </w:r>
-    </w:p>
-    <w:p>
-      <w:pPr>
-        <w:numPr>
-          <w:ilvl w:val="0"/>
-          <w:numId w:val="18"/>
-        </w:numPr>
-        <w:spacing w:after="0"/>
-      </w:pPr>
-      <w:r>
-        <w:t>ejercicio_1.py</w:t>
-      </w:r>
-    </w:p>
-    <w:p>
-      <w:pPr>
-        <w:numPr>
-          <w:ilvl w:val="0"/>
-          <w:numId w:val="18"/>
-        </w:numPr>
-        <w:spacing w:after="0"/>
-      </w:pPr>
-      <w:r>
-        <w:t>ejercicio_2.py</w:t>
-      </w:r>
-    </w:p>
-    <w:p>
-      <w:pPr>
-        <w:numPr>
-          <w:ilvl w:val="0"/>
-          <w:numId w:val="18"/>
-        </w:numPr>
-        <w:spacing w:after="0"/>
-      </w:pPr>
-      <w:r>
-        <w:t>ejercicio_3.py</w:t>
-      </w:r>
-    </w:p>
-    <w:p>
-      <w:pPr>
-        <w:spacing w:after="0"/>
-      </w:pPr>
-      <w:r>
-        <w:t>Los diagramas de flujo deberán entregarse en formato .</w:t>
-      </w:r>
-      <w:proofErr w:type="spellStart"/>
-      <w:r>
-        <w:t>pdf</w:t>
-      </w:r>
-      <w:proofErr w:type="spellEnd"/>
-      <w:r>
-        <w:t xml:space="preserve"> dentro del mismo archivo .zip.</w:t>
-      </w:r>
-    </w:p>
-    <w:p>
-      <w:pPr>
-        <w:spacing w:after="0"/>
-      </w:pPr>
-      <w:r>
-        <w:t>Nombre sugerido del archivo .zip:</w:t>
-      </w:r>
-    </w:p>
-    <w:p>
-      <w:pPr>
-        <w:pStyle w:val="Prrafodelista"/>
-        <w:numPr>
-          <w:ilvl w:val="0"/>
-          <w:numId w:val="19"/>
-        </w:numPr>
-        <w:spacing w:after="0"/>
-      </w:pPr>
-      <w:r>
-        <w:t>Semana_X_Apellido_Nombre.zip</w:t>
+        <w:t xml:space="preserve"> por cada ejercicio de Python realizado durante la semana. </w:t>
       </w:r>
       <w:r>
         <w:br w:type="page"/>
@@ -5419,6 +5311,7 @@
   <w:style w:type="character" w:default="1" w:styleId="Fuentedeprrafopredeter">
     <w:name w:val="Default Paragraph Font"/>
     <w:uiPriority w:val="1"/>
+    <w:semiHidden/>
     <w:unhideWhenUsed/>
   </w:style>
   <w:style w:type="table" w:default="1" w:styleId="Tablanormal">

</xml_diff>